<commit_message>
03 April - Updated the docket codes
</commit_message>
<xml_diff>
--- a/docassemble/Interpreternotice/data/templates/InterpreterNotice_-_with_variables.docx
+++ b/docassemble/Interpreternotice/data/templates/InterpreterNotice_-_with_variables.docx
@@ -230,21 +230,62 @@
             </w:r>
           </w:p>
           <w:p>
+            <w:pPr>
+              <w:pStyle w:val="HTMLPreformatted"/>
+            </w:pPr>
             <w:proofErr w:type="gramStart"/>
             <w:r>
+              <w:rPr>
+                <w:rFonts w:ascii="Times New Roman" w:hAnsi="Times New Roman" w:cs="Times New Roman"/>
+                <w:sz w:val="24"/>
+                <w:szCs w:val="24"/>
+              </w:rPr>
               <w:t xml:space="preserve">{{ </w:t>
             </w:r>
             <w:proofErr w:type="spellStart"/>
             <w:r>
+              <w:rPr>
+                <w:rFonts w:ascii="Times New Roman" w:hAnsi="Times New Roman" w:cs="Times New Roman"/>
+                <w:sz w:val="24"/>
+                <w:szCs w:val="24"/>
+              </w:rPr>
               <w:t>trial</w:t>
             </w:r>
             <w:proofErr w:type="gramEnd"/>
             <w:r>
+              <w:rPr>
+                <w:rFonts w:ascii="Times New Roman" w:hAnsi="Times New Roman" w:cs="Times New Roman"/>
+                <w:sz w:val="24"/>
+                <w:szCs w:val="24"/>
+              </w:rPr>
               <w:t>_court_docket_number</w:t>
             </w:r>
             <w:proofErr w:type="spellEnd"/>
             <w:r>
-              <w:t xml:space="preserve"> }}</w:t>
+              <w:rPr>
+                <w:rFonts w:ascii="Times New Roman" w:hAnsi="Times New Roman" w:cs="Times New Roman"/>
+                <w:sz w:val="24"/>
+                <w:szCs w:val="24"/>
+              </w:rPr>
+              <w:t xml:space="preserve"> if not </w:t>
+            </w:r>
+            <w:proofErr w:type="spellStart"/>
+            <w:r>
+              <w:rPr>
+                <w:rFonts w:ascii="Times New Roman" w:hAnsi="Times New Roman" w:cs="Times New Roman"/>
+                <w:sz w:val="24"/>
+                <w:szCs w:val="24"/>
+              </w:rPr>
+              <w:t>dont_know_docket_number</w:t>
+            </w:r>
+            <w:proofErr w:type="spellEnd"/>
+            <w:r>
+              <w:rPr>
+                <w:rFonts w:ascii="Times New Roman" w:hAnsi="Times New Roman" w:cs="Times New Roman"/>
+                <w:sz w:val="24"/>
+                <w:szCs w:val="24"/>
+              </w:rPr>
+              <w:t xml:space="preserve"> else '' }}</w:t>
             </w:r>
           </w:p>
         </w:tc>
@@ -1934,6 +1975,55 @@
       </w:tblBorders>
     </w:tblPr>
   </w:style>
+  <w:style w:type="paragraph" w:styleId="HTMLPreformatted">
+    <w:name w:val="HTML Preformatted"/>
+    <w:basedOn w:val="Normal"/>
+    <w:link w:val="HTMLPreformattedChar"/>
+    <w:uiPriority w:val="99"/>
+    <w:unhideWhenUsed/>
+    <w:rsid w:val="000512E7"/>
+    <w:pPr>
+      <w:widowControl/>
+      <w:tabs>
+        <w:tab w:val="left" w:pos="916"/>
+        <w:tab w:val="left" w:pos="1832"/>
+        <w:tab w:val="left" w:pos="2748"/>
+        <w:tab w:val="left" w:pos="3664"/>
+        <w:tab w:val="left" w:pos="4580"/>
+        <w:tab w:val="left" w:pos="5496"/>
+        <w:tab w:val="left" w:pos="6412"/>
+        <w:tab w:val="left" w:pos="7328"/>
+        <w:tab w:val="left" w:pos="8244"/>
+        <w:tab w:val="left" w:pos="9160"/>
+        <w:tab w:val="left" w:pos="10076"/>
+        <w:tab w:val="left" w:pos="10992"/>
+        <w:tab w:val="left" w:pos="11908"/>
+        <w:tab w:val="left" w:pos="12824"/>
+        <w:tab w:val="left" w:pos="13740"/>
+        <w:tab w:val="left" w:pos="14656"/>
+      </w:tabs>
+      <w:autoSpaceDE/>
+      <w:autoSpaceDN/>
+      <w:adjustRightInd/>
+    </w:pPr>
+    <w:rPr>
+      <w:rFonts w:ascii="Courier New" w:hAnsi="Courier New" w:cs="Courier New"/>
+      <w:sz w:val="20"/>
+      <w:szCs w:val="20"/>
+    </w:rPr>
+  </w:style>
+  <w:style w:type="character" w:customStyle="1" w:styleId="HTMLPreformattedChar">
+    <w:name w:val="HTML Preformatted Char"/>
+    <w:basedOn w:val="DefaultParagraphFont"/>
+    <w:link w:val="HTMLPreformatted"/>
+    <w:uiPriority w:val="99"/>
+    <w:rsid w:val="000512E7"/>
+    <w:rPr>
+      <w:rFonts w:ascii="Courier New" w:hAnsi="Courier New" w:cs="Courier New"/>
+      <w:sz w:val="20"/>
+      <w:szCs w:val="20"/>
+    </w:rPr>
+  </w:style>
 </w:styles>
 </file>
 
@@ -2205,6 +2295,15 @@
 </file>
 
 <file path=customXml/item2.xml><?xml version="1.0" encoding="utf-8"?>
+<?mso-contentType ?>
+<FormTemplates xmlns="http://schemas.microsoft.com/sharepoint/v3/contenttype/forms">
+  <Display>DocumentLibraryForm</Display>
+  <Edit>DocumentLibraryForm</Edit>
+  <New>DocumentLibraryForm</New>
+</FormTemplates>
+</file>
+
+<file path=customXml/item3.xml><?xml version="1.0" encoding="utf-8"?>
 <ct:contentTypeSchema xmlns:ct="http://schemas.microsoft.com/office/2006/metadata/contentType" xmlns:ma="http://schemas.microsoft.com/office/2006/metadata/properties/metaAttributes" ct:_="" ma:_="" ma:contentTypeName="Document" ma:contentTypeID="0x010100F92EF22037BC934BB7957F10A6A58565" ma:contentTypeVersion="5" ma:contentTypeDescription="Create a new document." ma:contentTypeScope="" ma:versionID="7a1c7a874952d885c4dca62e5368beab">
   <xsd:schema xmlns:xsd="http://www.w3.org/2001/XMLSchema" xmlns:xs="http://www.w3.org/2001/XMLSchema" xmlns:p="http://schemas.microsoft.com/office/2006/metadata/properties" xmlns:ns2="9ff3b30a-29ef-4990-8932-ca24fd3d6085" targetNamespace="http://schemas.microsoft.com/office/2006/metadata/properties" ma:root="true" ma:fieldsID="ce0714f15ee5e62cd8c8be7d683bfde9" ns2:_="">
     <xsd:import namespace="9ff3b30a-29ef-4990-8932-ca24fd3d6085"/>
@@ -2356,15 +2455,6 @@
 </ct:contentTypeSchema>
 </file>
 
-<file path=customXml/item3.xml><?xml version="1.0" encoding="utf-8"?>
-<?mso-contentType ?>
-<FormTemplates xmlns="http://schemas.microsoft.com/sharepoint/v3/contenttype/forms">
-  <Display>DocumentLibraryForm</Display>
-  <Edit>DocumentLibraryForm</Edit>
-  <New>DocumentLibraryForm</New>
-</FormTemplates>
-</file>
-
 <file path=customXml/itemProps1.xml><?xml version="1.0" encoding="utf-8"?>
 <ds:datastoreItem xmlns:ds="http://schemas.openxmlformats.org/officeDocument/2006/customXml" ds:itemID="{EAD498D0-277F-4D02-BBEB-90657F641208}">
   <ds:schemaRefs>
@@ -2375,6 +2465,14 @@
 </file>
 
 <file path=customXml/itemProps2.xml><?xml version="1.0" encoding="utf-8"?>
+<ds:datastoreItem xmlns:ds="http://schemas.openxmlformats.org/officeDocument/2006/customXml" ds:itemID="{A306F67B-C346-4543-8E9D-8DD2FE184445}">
+  <ds:schemaRefs>
+    <ds:schemaRef ds:uri="http://schemas.microsoft.com/sharepoint/v3/contenttype/forms"/>
+  </ds:schemaRefs>
+</ds:datastoreItem>
+</file>
+
+<file path=customXml/itemProps3.xml><?xml version="1.0" encoding="utf-8"?>
 <ds:datastoreItem xmlns:ds="http://schemas.openxmlformats.org/officeDocument/2006/customXml" ds:itemID="{B6C8712E-6029-4CB4-AF8D-CDEA1EACC57E}">
   <ds:schemaRefs>
     <ds:schemaRef ds:uri="http://schemas.microsoft.com/office/2006/metadata/contentType"/>
@@ -2390,12 +2488,4 @@
     <ds:schemaRef ds:uri="http://schemas.microsoft.com/internal/obd"/>
   </ds:schemaRefs>
 </ds:datastoreItem>
-</file>
-
-<file path=customXml/itemProps3.xml><?xml version="1.0" encoding="utf-8"?>
-<ds:datastoreItem xmlns:ds="http://schemas.openxmlformats.org/officeDocument/2006/customXml" ds:itemID="{A306F67B-C346-4543-8E9D-8DD2FE184445}">
-  <ds:schemaRefs>
-    <ds:schemaRef ds:uri="http://schemas.microsoft.com/sharepoint/v3/contenttype/forms"/>
-  </ds:schemaRefs>
-</ds:datastoreItem>
 </file>
</xml_diff>

<commit_message>
April 26 Fixed signature codes.  Fixed multiple addresses and names issue while in class.
</commit_message>
<xml_diff>
--- a/docassemble/Interpreternotice/data/templates/InterpreterNotice_-_with_variables.docx
+++ b/docassemble/Interpreternotice/data/templates/InterpreterNotice_-_with_variables.docx
@@ -109,21 +109,21 @@
             <w:proofErr w:type="spellStart"/>
             <w:r>
               <w:rPr>
-                <w:rFonts w:ascii="Calibri" w:eastAsia="Calibri" w:hAnsi="Calibri" w:cs="Calibri"/>
+                <w:rFonts w:eastAsia="Calibri"/>
               </w:rPr>
               <w:t>trial</w:t>
             </w:r>
             <w:proofErr w:type="gramEnd"/>
             <w:r>
               <w:rPr>
-                <w:rFonts w:ascii="Calibri" w:eastAsia="Calibri" w:hAnsi="Calibri" w:cs="Calibri"/>
+                <w:rFonts w:eastAsia="Calibri"/>
               </w:rPr>
               <w:t>_court.address.county</w:t>
             </w:r>
             <w:proofErr w:type="spellEnd"/>
             <w:r>
               <w:rPr>
-                <w:rFonts w:ascii="Calibri" w:eastAsia="Calibri" w:hAnsi="Calibri" w:cs="Calibri"/>
+                <w:rFonts w:eastAsia="Calibri"/>
               </w:rPr>
               <w:t xml:space="preserve"> }}, ss</w:t>
             </w:r>
@@ -143,28 +143,28 @@
             <w:proofErr w:type="gramStart"/>
             <w:r>
               <w:rPr>
-                <w:rFonts w:ascii="Calibri" w:eastAsia="Calibri" w:hAnsi="Calibri" w:cs="Calibri"/>
+                <w:rFonts w:eastAsia="Calibri"/>
               </w:rPr>
               <w:t xml:space="preserve">{{ </w:t>
             </w:r>
             <w:proofErr w:type="spellStart"/>
             <w:r>
               <w:rPr>
-                <w:rFonts w:ascii="Calibri" w:eastAsia="Calibri" w:hAnsi="Calibri" w:cs="Calibri"/>
+                <w:rFonts w:eastAsia="Calibri"/>
               </w:rPr>
               <w:t>trial</w:t>
             </w:r>
             <w:proofErr w:type="gramEnd"/>
             <w:r>
               <w:rPr>
-                <w:rFonts w:ascii="Calibri" w:eastAsia="Calibri" w:hAnsi="Calibri" w:cs="Calibri"/>
+                <w:rFonts w:eastAsia="Calibri"/>
               </w:rPr>
               <w:t>_court</w:t>
             </w:r>
             <w:proofErr w:type="spellEnd"/>
             <w:r>
               <w:rPr>
-                <w:rFonts w:ascii="Calibri" w:eastAsia="Calibri" w:hAnsi="Calibri" w:cs="Calibri"/>
+                <w:rFonts w:eastAsia="Calibri"/>
               </w:rPr>
               <w:t xml:space="preserve"> }}</w:t>
             </w:r>
@@ -232,6 +232,9 @@
           <w:p>
             <w:pPr>
               <w:pStyle w:val="HTMLPreformatted"/>
+              <w:rPr>
+                <w:rFonts w:ascii="Times New Roman" w:hAnsi="Times New Roman" w:cs="Times New Roman"/>
+              </w:rPr>
             </w:pPr>
             <w:proofErr w:type="gramStart"/>
             <w:r>
@@ -307,25 +310,22 @@
               <w:spacing w:line="240" w:lineRule="atLeast"/>
               <w:contextualSpacing/>
               <w:rPr>
-                <w:rFonts w:ascii="Calibri" w:eastAsia="Calibri" w:hAnsi="Calibri" w:cs="Calibri"/>
+                <w:rFonts w:eastAsia="Calibri"/>
               </w:rPr>
             </w:pPr>
             <w:proofErr w:type="gramStart"/>
             <w:r>
               <w:rPr>
-                <w:rFonts w:ascii="Calibri" w:eastAsia="Calibri" w:hAnsi="Calibri" w:cs="Calibri"/>
+                <w:rFonts w:eastAsia="Calibri"/>
               </w:rPr>
               <w:t>{{ plaintiffs</w:t>
             </w:r>
             <w:proofErr w:type="gramEnd"/>
             <w:r>
               <w:rPr>
-                <w:rFonts w:ascii="Calibri" w:eastAsia="Calibri" w:hAnsi="Calibri" w:cs="Calibri"/>
+                <w:rFonts w:eastAsia="Calibri"/>
               </w:rPr>
               <w:t xml:space="preserve"> }}</w:t>
-            </w:r>
-            <w:r>
-              <w:t>,</w:t>
             </w:r>
           </w:p>
           <w:p>
@@ -389,6 +389,7 @@
             </w:tcBorders>
           </w:tcPr>
           <w:p>
+            <w:proofErr w:type="gramStart"/>
             <w:r>
               <w:rPr>
                 <w:b/>
@@ -402,36 +403,37 @@
                 <w:b/>
                 <w:bCs/>
               </w:rPr>
-              <w:t>party_role</w:t>
-            </w:r>
+              <w:t>party</w:t>
+            </w:r>
+            <w:proofErr w:type="gramEnd"/>
             <w:r>
               <w:rPr>
                 <w:b/>
                 <w:bCs/>
               </w:rPr>
-              <w:t>.upper</w:t>
-            </w:r>
-            <w:proofErr w:type="spellEnd"/>
+              <w:t>_role</w:t>
+            </w:r>
             <w:r>
               <w:rPr>
                 <w:b/>
                 <w:bCs/>
               </w:rPr>
-              <w:t>()</w:t>
-            </w:r>
+              <w:t>.upper</w:t>
+            </w:r>
+            <w:proofErr w:type="spellEnd"/>
             <w:r>
               <w:rPr>
                 <w:b/>
                 <w:bCs/>
               </w:rPr>
-              <w:t xml:space="preserve"> </w:t>
+              <w:t>()</w:t>
             </w:r>
             <w:r>
               <w:rPr>
                 <w:b/>
                 <w:bCs/>
               </w:rPr>
-              <w:t>}}</w:t>
+              <w:t xml:space="preserve"> }}</w:t>
             </w:r>
             <w:r>
               <w:rPr>
@@ -439,7 +441,7 @@
                 <w:bCs/>
                 <w:caps/>
               </w:rPr>
-              <w:t xml:space="preserve"> 'S NOTICE OF REQUEST FOR INTERPRETER</w:t>
+              <w:t>'S NOTICE OF REQUEST FOR INTERPRETER</w:t>
             </w:r>
           </w:p>
         </w:tc>
@@ -463,20 +465,20 @@
               <w:spacing w:line="240" w:lineRule="atLeast"/>
               <w:ind w:left="5040" w:hanging="5040"/>
               <w:rPr>
-                <w:rFonts w:ascii="Calibri" w:eastAsia="Calibri" w:hAnsi="Calibri" w:cs="Calibri"/>
+                <w:rFonts w:eastAsia="Calibri"/>
               </w:rPr>
             </w:pPr>
             <w:proofErr w:type="gramStart"/>
             <w:r>
               <w:rPr>
-                <w:rFonts w:ascii="Calibri" w:eastAsia="Calibri" w:hAnsi="Calibri" w:cs="Calibri"/>
+                <w:rFonts w:eastAsia="Calibri"/>
               </w:rPr>
               <w:t>{{ defendants</w:t>
             </w:r>
             <w:proofErr w:type="gramEnd"/>
             <w:r>
               <w:rPr>
-                <w:rFonts w:ascii="Calibri" w:eastAsia="Calibri" w:hAnsi="Calibri" w:cs="Calibri"/>
+                <w:rFonts w:eastAsia="Calibri"/>
               </w:rPr>
               <w:t xml:space="preserve"> }}</w:t>
             </w:r>
@@ -772,6 +774,9 @@
             </w:r>
             <w:proofErr w:type="gramEnd"/>
             <w:r>
+              <w:t>[0]</w:t>
+            </w:r>
+            <w:r>
               <w:t xml:space="preserve"> }}, {{ </w:t>
             </w:r>
             <w:proofErr w:type="spellStart"/>
@@ -920,6 +925,12 @@
               <w:rPr>
                 <w:rFonts w:eastAsia="Calibri"/>
               </w:rPr>
+              <w:t>[0]</w:t>
+            </w:r>
+            <w:r>
+              <w:rPr>
+                <w:rFonts w:eastAsia="Calibri"/>
+              </w:rPr>
               <w:t xml:space="preserve"> }}</w:t>
             </w:r>
           </w:p>
@@ -1038,7 +1049,7 @@
         <w:keepLines/>
         <w:jc w:val="both"/>
         <w:rPr>
-          <w:rFonts w:ascii="Calibri" w:eastAsia="Calibri" w:hAnsi="Calibri" w:cs="Calibri"/>
+          <w:rFonts w:eastAsia="Calibri"/>
         </w:rPr>
       </w:pPr>
     </w:p>

</xml_diff>